<commit_message>
Klassenrat: Originallogo der Schule und exakte Logofarben verwenden
Co-Authored-By: Claude Opus 5.5 <noreply@anthropic.com>
Claude-Session: https://claude.ai/code/session_01GUSR1r1jURoza6XX9S8oAm
</commit_message>
<xml_diff>
--- a/klassenrat/word/protokoll-grundschule.docx
+++ b/klassenrat/word/protokoll-grundschule.docx
@@ -42,7 +42,7 @@
             <w:r>
               <w:drawing>
                 <wp:inline xmlns:a="http://schemas.openxmlformats.org/drawingml/2006/main" xmlns:pic="http://schemas.openxmlformats.org/drawingml/2006/picture">
-                  <wp:extent cx="1512000" cy="756000"/>
+                  <wp:extent cx="1505976" cy="756000"/>
                   <wp:docPr id="1" name="Picture 1"/>
                   <wp:cNvGraphicFramePr>
                     <a:graphicFrameLocks noChangeAspect="1"/>
@@ -63,7 +63,7 @@
                         <pic:spPr>
                           <a:xfrm>
                             <a:off x="0" y="0"/>
-                            <a:ext cx="1512000" cy="756000"/>
+                            <a:ext cx="1505976" cy="756000"/>
                           </a:xfrm>
                           <a:prstGeom prst="rect"/>
                         </pic:spPr>
@@ -101,7 +101,7 @@
             <w:r>
               <w:rPr>
                 <w:b/>
-                <w:color w:val="B32D3B"/>
+                <w:color w:val="A64A50"/>
                 <w:sz w:val="42"/>
               </w:rPr>
               <w:t>Unser Klassenrat</w:t>
@@ -348,7 +348,7 @@
         <w:tc>
           <w:tcPr>
             <w:tcW w:type="dxa" w:w="10545"/>
-            <w:shd w:val="clear" w:color="auto" w:fill="FBEAEC"/>
+            <w:shd w:val="clear" w:color="auto" w:fill="F8E9EA"/>
             <w:tcBorders>
               <w:top w:val="nil"/>
               <w:left w:val="nil"/>
@@ -400,7 +400,7 @@
             <w:r>
               <w:rPr>
                 <w:b/>
-                <w:color w:val="B32D3B"/>
+                <w:color w:val="A64A50"/>
                 <w:sz w:val="26"/>
               </w:rPr>
               <w:t>Wer macht heute was?</w:t>
@@ -831,7 +831,7 @@
         <w:tc>
           <w:tcPr>
             <w:tcW w:type="dxa" w:w="10545"/>
-            <w:shd w:val="clear" w:color="auto" w:fill="FBEAEC"/>
+            <w:shd w:val="clear" w:color="auto" w:fill="F8E9EA"/>
             <w:tcBorders>
               <w:top w:val="nil"/>
               <w:left w:val="nil"/>
@@ -883,7 +883,7 @@
             <w:r>
               <w:rPr>
                 <w:b/>
-                <w:color w:val="B32D3B"/>
+                <w:color w:val="A64A50"/>
                 <w:sz w:val="26"/>
               </w:rPr>
               <w:t>1  Das war schön</w:t>
@@ -1134,7 +1134,7 @@
         <w:tc>
           <w:tcPr>
             <w:tcW w:type="dxa" w:w="10545"/>
-            <w:shd w:val="clear" w:color="auto" w:fill="FBEAEC"/>
+            <w:shd w:val="clear" w:color="auto" w:fill="F8E9EA"/>
             <w:tcBorders>
               <w:top w:val="nil"/>
               <w:left w:val="nil"/>
@@ -1186,7 +1186,7 @@
             <w:r>
               <w:rPr>
                 <w:b/>
-                <w:color w:val="B32D3B"/>
+                <w:color w:val="A64A50"/>
                 <w:sz w:val="26"/>
               </w:rPr>
               <w:t>2  Hat es geklappt?</w:t>
@@ -1494,7 +1494,7 @@
         <w:tc>
           <w:tcPr>
             <w:tcW w:type="dxa" w:w="10545"/>
-            <w:shd w:val="clear" w:color="auto" w:fill="FBEAEC"/>
+            <w:shd w:val="clear" w:color="auto" w:fill="F8E9EA"/>
             <w:tcBorders>
               <w:top w:val="nil"/>
               <w:left w:val="nil"/>
@@ -1546,7 +1546,7 @@
             <w:r>
               <w:rPr>
                 <w:b/>
-                <w:color w:val="B32D3B"/>
+                <w:color w:val="A64A50"/>
                 <w:sz w:val="26"/>
               </w:rPr>
               <w:t>3  Darüber sprechen wir heute</w:t>
@@ -1908,7 +1908,7 @@
         <w:tc>
           <w:tcPr>
             <w:tcW w:type="dxa" w:w="10545"/>
-            <w:shd w:val="clear" w:color="auto" w:fill="B32D3B"/>
+            <w:shd w:val="clear" w:color="auto" w:fill="A64A50"/>
           </w:tcPr>
           <w:p>
             <w:pPr>
@@ -2111,7 +2111,7 @@
       <w:r>
         <w:rPr>
           <w:b/>
-          <w:color w:val="B32D3B"/>
+          <w:color w:val="A64A50"/>
           <w:sz w:val="22"/>
         </w:rPr>
         <w:t>Was sagen die Kinder?</w:t>
@@ -2376,7 +2376,7 @@
       <w:r>
         <w:rPr>
           <w:b/>
-          <w:color w:val="B32D3B"/>
+          <w:color w:val="A64A50"/>
           <w:sz w:val="22"/>
         </w:rPr>
         <w:t>Unsere Ideen</w:t>
@@ -2928,7 +2928,7 @@
         <w:tc>
           <w:tcPr>
             <w:tcW w:type="dxa" w:w="10545"/>
-            <w:shd w:val="clear" w:color="auto" w:fill="B32D3B"/>
+            <w:shd w:val="clear" w:color="auto" w:fill="A64A50"/>
           </w:tcPr>
           <w:p>
             <w:pPr>
@@ -3131,7 +3131,7 @@
       <w:r>
         <w:rPr>
           <w:b/>
-          <w:color w:val="B32D3B"/>
+          <w:color w:val="A64A50"/>
           <w:sz w:val="22"/>
         </w:rPr>
         <w:t>Was sagen die Kinder?</w:t>
@@ -3396,7 +3396,7 @@
       <w:r>
         <w:rPr>
           <w:b/>
-          <w:color w:val="B32D3B"/>
+          <w:color w:val="A64A50"/>
           <w:sz w:val="22"/>
         </w:rPr>
         <w:t>Unsere Ideen</w:t>
@@ -3956,7 +3956,7 @@
         <w:tc>
           <w:tcPr>
             <w:tcW w:type="dxa" w:w="10545"/>
-            <w:shd w:val="clear" w:color="auto" w:fill="B32D3B"/>
+            <w:shd w:val="clear" w:color="auto" w:fill="A64A50"/>
           </w:tcPr>
           <w:p>
             <w:pPr>
@@ -4159,7 +4159,7 @@
       <w:r>
         <w:rPr>
           <w:b/>
-          <w:color w:val="B32D3B"/>
+          <w:color w:val="A64A50"/>
           <w:sz w:val="22"/>
         </w:rPr>
         <w:t>Was sagen die Kinder?</w:t>
@@ -4424,7 +4424,7 @@
       <w:r>
         <w:rPr>
           <w:b/>
-          <w:color w:val="B32D3B"/>
+          <w:color w:val="A64A50"/>
           <w:sz w:val="22"/>
         </w:rPr>
         <w:t>Unsere Ideen</w:t>
@@ -4976,7 +4976,7 @@
         <w:tc>
           <w:tcPr>
             <w:tcW w:type="dxa" w:w="10545"/>
-            <w:shd w:val="clear" w:color="auto" w:fill="FBEAEC"/>
+            <w:shd w:val="clear" w:color="auto" w:fill="F8E9EA"/>
             <w:tcBorders>
               <w:top w:val="nil"/>
               <w:left w:val="nil"/>
@@ -5028,7 +5028,7 @@
             <w:r>
               <w:rPr>
                 <w:b/>
-                <w:color w:val="B32D3B"/>
+                <w:color w:val="A64A50"/>
                 <w:sz w:val="26"/>
               </w:rPr>
               <w:t>4  Wie war unser Klassenrat?</w:t>
@@ -5338,7 +5338,7 @@
       <w:r>
         <w:rPr>
           <w:b/>
-          <w:color w:val="B32D3B"/>
+          <w:color w:val="A64A50"/>
           <w:sz w:val="22"/>
         </w:rPr>
         <w:t>Wer macht nächstes Mal was?</w:t>

</xml_diff>

<commit_message>
Klassenrat: Schullogo entfernt (nur lokal hinterlegbar), App-Symbol, Laden auf dem iPad
- kein Schullogo mehr in Tool, Druckbögen, Karten und Repository; im Tool hochladen und entfernen
- App-Symbol für den Home-Bildschirm und Browser-Tab
- Sicherung laden über echtes Dateifeld (iPad/Safari)

Co-Authored-By: Claude Opus 5.5 <noreply@anthropic.com>
Claude-Session: https://claude.ai/code/session_01GUSR1r1jURoza6XX9S8oAm
</commit_message>
<xml_diff>
--- a/klassenrat/word/protokoll-grundschule.docx
+++ b/klassenrat/word/protokoll-grundschule.docx
@@ -15,14 +15,14 @@
         <w:tblLook w:firstColumn="1" w:firstRow="1" w:lastColumn="0" w:lastRow="0" w:noHBand="0" w:noVBand="1" w:val="04A0"/>
       </w:tblPr>
       <w:tblGrid>
-        <w:gridCol w:w="2494"/>
-        <w:gridCol w:w="5216"/>
+        <w:gridCol w:w="57"/>
+        <w:gridCol w:w="7654"/>
         <w:gridCol w:w="2835"/>
       </w:tblGrid>
       <w:tr>
         <w:tc>
           <w:tcPr>
-            <w:tcW w:type="dxa" w:w="2494"/>
+            <w:tcW w:type="dxa" w:w="57"/>
             <w:tcBorders>
               <w:top w:val="nil"/>
               <w:left w:val="nil"/>
@@ -39,45 +39,11 @@
             <w:pPr>
               <w:spacing w:before="0" w:after="0"/>
             </w:pPr>
-            <w:r>
-              <w:drawing>
-                <wp:inline xmlns:a="http://schemas.openxmlformats.org/drawingml/2006/main" xmlns:pic="http://schemas.openxmlformats.org/drawingml/2006/picture">
-                  <wp:extent cx="1505976" cy="756000"/>
-                  <wp:docPr id="1" name="Picture 1"/>
-                  <wp:cNvGraphicFramePr>
-                    <a:graphicFrameLocks noChangeAspect="1"/>
-                  </wp:cNvGraphicFramePr>
-                  <a:graphic>
-                    <a:graphicData uri="http://schemas.openxmlformats.org/drawingml/2006/picture">
-                      <pic:pic>
-                        <pic:nvPicPr>
-                          <pic:cNvPr id="0" name="logo.png"/>
-                          <pic:cNvPicPr/>
-                        </pic:nvPicPr>
-                        <pic:blipFill>
-                          <a:blip r:embed="rId10"/>
-                          <a:stretch>
-                            <a:fillRect/>
-                          </a:stretch>
-                        </pic:blipFill>
-                        <pic:spPr>
-                          <a:xfrm>
-                            <a:off x="0" y="0"/>
-                            <a:ext cx="1505976" cy="756000"/>
-                          </a:xfrm>
-                          <a:prstGeom prst="rect"/>
-                        </pic:spPr>
-                      </pic:pic>
-                    </a:graphicData>
-                  </a:graphic>
-                </wp:inline>
-              </w:drawing>
-            </w:r>
           </w:p>
         </w:tc>
         <w:tc>
           <w:tcPr>
-            <w:tcW w:type="dxa" w:w="5216"/>
+            <w:tcW w:type="dxa" w:w="7654"/>
             <w:tcBorders>
               <w:top w:val="nil"/>
               <w:left w:val="nil"/>
@@ -141,7 +107,7 @@
               <w:drawing>
                 <wp:inline xmlns:a="http://schemas.openxmlformats.org/drawingml/2006/main" xmlns:pic="http://schemas.openxmlformats.org/drawingml/2006/picture">
                   <wp:extent cx="1752381" cy="828000"/>
-                  <wp:docPr id="2" name="Picture 2"/>
+                  <wp:docPr id="1" name="Picture 1"/>
                   <wp:cNvGraphicFramePr>
                     <a:graphicFrameLocks noChangeAspect="1"/>
                   </wp:cNvGraphicFramePr>
@@ -153,7 +119,7 @@
                           <pic:cNvPicPr/>
                         </pic:nvPicPr>
                         <pic:blipFill>
-                          <a:blip r:embed="rId11"/>
+                          <a:blip r:embed="rId10"/>
                           <a:stretch>
                             <a:fillRect/>
                           </a:stretch>
@@ -364,7 +330,7 @@
               <w:drawing>
                 <wp:inline xmlns:a="http://schemas.openxmlformats.org/drawingml/2006/main" xmlns:pic="http://schemas.openxmlformats.org/drawingml/2006/picture">
                   <wp:extent cx="252000" cy="252000"/>
-                  <wp:docPr id="3" name="Picture 3"/>
+                  <wp:docPr id="2" name="Picture 2"/>
                   <wp:cNvGraphicFramePr>
                     <a:graphicFrameLocks noChangeAspect="1"/>
                   </wp:cNvGraphicFramePr>
@@ -376,7 +342,7 @@
                           <pic:cNvPicPr/>
                         </pic:nvPicPr>
                         <pic:blipFill>
-                          <a:blip r:embed="rId12"/>
+                          <a:blip r:embed="rId11"/>
                           <a:stretch>
                             <a:fillRect/>
                           </a:stretch>
@@ -450,7 +416,7 @@
               <w:drawing>
                 <wp:inline xmlns:a="http://schemas.openxmlformats.org/drawingml/2006/main" xmlns:pic="http://schemas.openxmlformats.org/drawingml/2006/picture">
                   <wp:extent cx="216000" cy="216000"/>
-                  <wp:docPr id="4" name="Picture 4"/>
+                  <wp:docPr id="3" name="Picture 3"/>
                   <wp:cNvGraphicFramePr>
                     <a:graphicFrameLocks noChangeAspect="1"/>
                   </wp:cNvGraphicFramePr>
@@ -462,7 +428,7 @@
                           <pic:cNvPicPr/>
                         </pic:nvPicPr>
                         <pic:blipFill>
-                          <a:blip r:embed="rId13"/>
+                          <a:blip r:embed="rId12"/>
                           <a:stretch>
                             <a:fillRect/>
                           </a:stretch>
@@ -527,7 +493,7 @@
               <w:drawing>
                 <wp:inline xmlns:a="http://schemas.openxmlformats.org/drawingml/2006/main" xmlns:pic="http://schemas.openxmlformats.org/drawingml/2006/picture">
                   <wp:extent cx="216000" cy="216000"/>
-                  <wp:docPr id="5" name="Picture 5"/>
+                  <wp:docPr id="4" name="Picture 4"/>
                   <wp:cNvGraphicFramePr>
                     <a:graphicFrameLocks noChangeAspect="1"/>
                   </wp:cNvGraphicFramePr>
@@ -539,7 +505,7 @@
                           <pic:cNvPicPr/>
                         </pic:nvPicPr>
                         <pic:blipFill>
-                          <a:blip r:embed="rId14"/>
+                          <a:blip r:embed="rId13"/>
                           <a:stretch>
                             <a:fillRect/>
                           </a:stretch>
@@ -623,7 +589,7 @@
               <w:drawing>
                 <wp:inline xmlns:a="http://schemas.openxmlformats.org/drawingml/2006/main" xmlns:pic="http://schemas.openxmlformats.org/drawingml/2006/picture">
                   <wp:extent cx="216000" cy="216000"/>
-                  <wp:docPr id="6" name="Picture 6"/>
+                  <wp:docPr id="5" name="Picture 5"/>
                   <wp:cNvGraphicFramePr>
                     <a:graphicFrameLocks noChangeAspect="1"/>
                   </wp:cNvGraphicFramePr>
@@ -635,7 +601,7 @@
                           <pic:cNvPicPr/>
                         </pic:nvPicPr>
                         <pic:blipFill>
-                          <a:blip r:embed="rId15"/>
+                          <a:blip r:embed="rId14"/>
                           <a:stretch>
                             <a:fillRect/>
                           </a:stretch>
@@ -700,7 +666,7 @@
               <w:drawing>
                 <wp:inline xmlns:a="http://schemas.openxmlformats.org/drawingml/2006/main" xmlns:pic="http://schemas.openxmlformats.org/drawingml/2006/picture">
                   <wp:extent cx="216000" cy="216000"/>
-                  <wp:docPr id="7" name="Picture 7"/>
+                  <wp:docPr id="6" name="Picture 6"/>
                   <wp:cNvGraphicFramePr>
                     <a:graphicFrameLocks noChangeAspect="1"/>
                   </wp:cNvGraphicFramePr>
@@ -712,7 +678,7 @@
                           <pic:cNvPicPr/>
                         </pic:nvPicPr>
                         <pic:blipFill>
-                          <a:blip r:embed="rId16"/>
+                          <a:blip r:embed="rId15"/>
                           <a:stretch>
                             <a:fillRect/>
                           </a:stretch>
@@ -847,7 +813,7 @@
               <w:drawing>
                 <wp:inline xmlns:a="http://schemas.openxmlformats.org/drawingml/2006/main" xmlns:pic="http://schemas.openxmlformats.org/drawingml/2006/picture">
                   <wp:extent cx="252000" cy="252000"/>
-                  <wp:docPr id="8" name="Picture 8"/>
+                  <wp:docPr id="7" name="Picture 7"/>
                   <wp:cNvGraphicFramePr>
                     <a:graphicFrameLocks noChangeAspect="1"/>
                   </wp:cNvGraphicFramePr>
@@ -859,7 +825,7 @@
                           <pic:cNvPicPr/>
                         </pic:nvPicPr>
                         <pic:blipFill>
-                          <a:blip r:embed="rId17"/>
+                          <a:blip r:embed="rId16"/>
                           <a:stretch>
                             <a:fillRect/>
                           </a:stretch>
@@ -1150,7 +1116,7 @@
               <w:drawing>
                 <wp:inline xmlns:a="http://schemas.openxmlformats.org/drawingml/2006/main" xmlns:pic="http://schemas.openxmlformats.org/drawingml/2006/picture">
                   <wp:extent cx="252000" cy="252000"/>
-                  <wp:docPr id="9" name="Picture 9"/>
+                  <wp:docPr id="8" name="Picture 8"/>
                   <wp:cNvGraphicFramePr>
                     <a:graphicFrameLocks noChangeAspect="1"/>
                   </wp:cNvGraphicFramePr>
@@ -1162,7 +1128,7 @@
                           <pic:cNvPicPr/>
                         </pic:nvPicPr>
                         <pic:blipFill>
-                          <a:blip r:embed="rId18"/>
+                          <a:blip r:embed="rId17"/>
                           <a:stretch>
                             <a:fillRect/>
                           </a:stretch>
@@ -1510,7 +1476,7 @@
               <w:drawing>
                 <wp:inline xmlns:a="http://schemas.openxmlformats.org/drawingml/2006/main" xmlns:pic="http://schemas.openxmlformats.org/drawingml/2006/picture">
                   <wp:extent cx="252000" cy="252000"/>
-                  <wp:docPr id="10" name="Picture 10"/>
+                  <wp:docPr id="9" name="Picture 9"/>
                   <wp:cNvGraphicFramePr>
                     <a:graphicFrameLocks noChangeAspect="1"/>
                   </wp:cNvGraphicFramePr>
@@ -1522,7 +1488,7 @@
                           <pic:cNvPicPr/>
                         </pic:nvPicPr>
                         <pic:blipFill>
-                          <a:blip r:embed="rId19"/>
+                          <a:blip r:embed="rId18"/>
                           <a:stretch>
                             <a:fillRect/>
                           </a:stretch>
@@ -1918,7 +1884,7 @@
               <w:drawing>
                 <wp:inline xmlns:a="http://schemas.openxmlformats.org/drawingml/2006/main" xmlns:pic="http://schemas.openxmlformats.org/drawingml/2006/picture">
                   <wp:extent cx="234000" cy="234000"/>
-                  <wp:docPr id="11" name="Picture 11"/>
+                  <wp:docPr id="10" name="Picture 10"/>
                   <wp:cNvGraphicFramePr>
                     <a:graphicFrameLocks noChangeAspect="1"/>
                   </wp:cNvGraphicFramePr>
@@ -1930,7 +1896,7 @@
                           <pic:cNvPicPr/>
                         </pic:nvPicPr>
                         <pic:blipFill>
-                          <a:blip r:embed="rId20"/>
+                          <a:blip r:embed="rId19"/>
                           <a:stretch>
                             <a:fillRect/>
                           </a:stretch>
@@ -2075,7 +2041,7 @@
         <w:drawing>
           <wp:inline xmlns:a="http://schemas.openxmlformats.org/drawingml/2006/main" xmlns:pic="http://schemas.openxmlformats.org/drawingml/2006/picture">
             <wp:extent cx="198000" cy="198000"/>
-            <wp:docPr id="12" name="Picture 12"/>
+            <wp:docPr id="11" name="Picture 11"/>
             <wp:cNvGraphicFramePr>
               <a:graphicFrameLocks noChangeAspect="1"/>
             </wp:cNvGraphicFramePr>
@@ -2087,7 +2053,7 @@
                     <pic:cNvPicPr/>
                   </pic:nvPicPr>
                   <pic:blipFill>
-                    <a:blip r:embed="rId20"/>
+                    <a:blip r:embed="rId19"/>
                     <a:stretch>
                       <a:fillRect/>
                     </a:stretch>
@@ -2340,7 +2306,7 @@
         <w:drawing>
           <wp:inline xmlns:a="http://schemas.openxmlformats.org/drawingml/2006/main" xmlns:pic="http://schemas.openxmlformats.org/drawingml/2006/picture">
             <wp:extent cx="198000" cy="198000"/>
-            <wp:docPr id="13" name="Picture 13"/>
+            <wp:docPr id="12" name="Picture 12"/>
             <wp:cNvGraphicFramePr>
               <a:graphicFrameLocks noChangeAspect="1"/>
             </wp:cNvGraphicFramePr>
@@ -2352,7 +2318,7 @@
                     <pic:cNvPicPr/>
                   </pic:nvPicPr>
                   <pic:blipFill>
-                    <a:blip r:embed="rId21"/>
+                    <a:blip r:embed="rId20"/>
                     <a:stretch>
                       <a:fillRect/>
                     </a:stretch>
@@ -2463,7 +2429,7 @@
               <w:drawing>
                 <wp:inline xmlns:a="http://schemas.openxmlformats.org/drawingml/2006/main" xmlns:pic="http://schemas.openxmlformats.org/drawingml/2006/picture">
                   <wp:extent cx="180000" cy="180000"/>
-                  <wp:docPr id="14" name="Picture 14"/>
+                  <wp:docPr id="13" name="Picture 13"/>
                   <wp:cNvGraphicFramePr>
                     <a:graphicFrameLocks noChangeAspect="1"/>
                   </wp:cNvGraphicFramePr>
@@ -2475,7 +2441,7 @@
                           <pic:cNvPicPr/>
                         </pic:nvPicPr>
                         <pic:blipFill>
-                          <a:blip r:embed="rId22"/>
+                          <a:blip r:embed="rId21"/>
                           <a:stretch>
                             <a:fillRect/>
                           </a:stretch>
@@ -2521,7 +2487,7 @@
               <w:drawing>
                 <wp:inline xmlns:a="http://schemas.openxmlformats.org/drawingml/2006/main" xmlns:pic="http://schemas.openxmlformats.org/drawingml/2006/picture">
                   <wp:extent cx="180000" cy="180000"/>
-                  <wp:docPr id="15" name="Picture 15"/>
+                  <wp:docPr id="14" name="Picture 14"/>
                   <wp:cNvGraphicFramePr>
                     <a:graphicFrameLocks noChangeAspect="1"/>
                   </wp:cNvGraphicFramePr>
@@ -2533,7 +2499,7 @@
                           <pic:cNvPicPr/>
                         </pic:nvPicPr>
                         <pic:blipFill>
-                          <a:blip r:embed="rId23"/>
+                          <a:blip r:embed="rId22"/>
                           <a:stretch>
                             <a:fillRect/>
                           </a:stretch>
@@ -2739,7 +2705,7 @@
               <w:drawing>
                 <wp:inline xmlns:a="http://schemas.openxmlformats.org/drawingml/2006/main" xmlns:pic="http://schemas.openxmlformats.org/drawingml/2006/picture">
                   <wp:extent cx="216000" cy="216000"/>
-                  <wp:docPr id="16" name="Picture 16"/>
+                  <wp:docPr id="15" name="Picture 15"/>
                   <wp:cNvGraphicFramePr>
                     <a:graphicFrameLocks noChangeAspect="1"/>
                   </wp:cNvGraphicFramePr>
@@ -2751,7 +2717,7 @@
                           <pic:cNvPicPr/>
                         </pic:nvPicPr>
                         <pic:blipFill>
-                          <a:blip r:embed="rId24"/>
+                          <a:blip r:embed="rId23"/>
                           <a:stretch>
                             <a:fillRect/>
                           </a:stretch>
@@ -2938,7 +2904,7 @@
               <w:drawing>
                 <wp:inline xmlns:a="http://schemas.openxmlformats.org/drawingml/2006/main" xmlns:pic="http://schemas.openxmlformats.org/drawingml/2006/picture">
                   <wp:extent cx="234000" cy="234000"/>
-                  <wp:docPr id="17" name="Picture 17"/>
+                  <wp:docPr id="16" name="Picture 16"/>
                   <wp:cNvGraphicFramePr>
                     <a:graphicFrameLocks noChangeAspect="1"/>
                   </wp:cNvGraphicFramePr>
@@ -2950,7 +2916,7 @@
                           <pic:cNvPicPr/>
                         </pic:nvPicPr>
                         <pic:blipFill>
-                          <a:blip r:embed="rId20"/>
+                          <a:blip r:embed="rId19"/>
                           <a:stretch>
                             <a:fillRect/>
                           </a:stretch>
@@ -3095,7 +3061,7 @@
         <w:drawing>
           <wp:inline xmlns:a="http://schemas.openxmlformats.org/drawingml/2006/main" xmlns:pic="http://schemas.openxmlformats.org/drawingml/2006/picture">
             <wp:extent cx="198000" cy="198000"/>
-            <wp:docPr id="18" name="Picture 18"/>
+            <wp:docPr id="17" name="Picture 17"/>
             <wp:cNvGraphicFramePr>
               <a:graphicFrameLocks noChangeAspect="1"/>
             </wp:cNvGraphicFramePr>
@@ -3107,7 +3073,7 @@
                     <pic:cNvPicPr/>
                   </pic:nvPicPr>
                   <pic:blipFill>
-                    <a:blip r:embed="rId20"/>
+                    <a:blip r:embed="rId19"/>
                     <a:stretch>
                       <a:fillRect/>
                     </a:stretch>
@@ -3360,7 +3326,7 @@
         <w:drawing>
           <wp:inline xmlns:a="http://schemas.openxmlformats.org/drawingml/2006/main" xmlns:pic="http://schemas.openxmlformats.org/drawingml/2006/picture">
             <wp:extent cx="198000" cy="198000"/>
-            <wp:docPr id="19" name="Picture 19"/>
+            <wp:docPr id="18" name="Picture 18"/>
             <wp:cNvGraphicFramePr>
               <a:graphicFrameLocks noChangeAspect="1"/>
             </wp:cNvGraphicFramePr>
@@ -3372,7 +3338,7 @@
                     <pic:cNvPicPr/>
                   </pic:nvPicPr>
                   <pic:blipFill>
-                    <a:blip r:embed="rId21"/>
+                    <a:blip r:embed="rId20"/>
                     <a:stretch>
                       <a:fillRect/>
                     </a:stretch>
@@ -3483,7 +3449,7 @@
               <w:drawing>
                 <wp:inline xmlns:a="http://schemas.openxmlformats.org/drawingml/2006/main" xmlns:pic="http://schemas.openxmlformats.org/drawingml/2006/picture">
                   <wp:extent cx="180000" cy="180000"/>
-                  <wp:docPr id="20" name="Picture 20"/>
+                  <wp:docPr id="19" name="Picture 19"/>
                   <wp:cNvGraphicFramePr>
                     <a:graphicFrameLocks noChangeAspect="1"/>
                   </wp:cNvGraphicFramePr>
@@ -3495,7 +3461,7 @@
                           <pic:cNvPicPr/>
                         </pic:nvPicPr>
                         <pic:blipFill>
-                          <a:blip r:embed="rId22"/>
+                          <a:blip r:embed="rId21"/>
                           <a:stretch>
                             <a:fillRect/>
                           </a:stretch>
@@ -3541,7 +3507,7 @@
               <w:drawing>
                 <wp:inline xmlns:a="http://schemas.openxmlformats.org/drawingml/2006/main" xmlns:pic="http://schemas.openxmlformats.org/drawingml/2006/picture">
                   <wp:extent cx="180000" cy="180000"/>
-                  <wp:docPr id="21" name="Picture 21"/>
+                  <wp:docPr id="20" name="Picture 20"/>
                   <wp:cNvGraphicFramePr>
                     <a:graphicFrameLocks noChangeAspect="1"/>
                   </wp:cNvGraphicFramePr>
@@ -3553,7 +3519,7 @@
                           <pic:cNvPicPr/>
                         </pic:nvPicPr>
                         <pic:blipFill>
-                          <a:blip r:embed="rId23"/>
+                          <a:blip r:embed="rId22"/>
                           <a:stretch>
                             <a:fillRect/>
                           </a:stretch>
@@ -3759,7 +3725,7 @@
               <w:drawing>
                 <wp:inline xmlns:a="http://schemas.openxmlformats.org/drawingml/2006/main" xmlns:pic="http://schemas.openxmlformats.org/drawingml/2006/picture">
                   <wp:extent cx="216000" cy="216000"/>
-                  <wp:docPr id="22" name="Picture 22"/>
+                  <wp:docPr id="21" name="Picture 21"/>
                   <wp:cNvGraphicFramePr>
                     <a:graphicFrameLocks noChangeAspect="1"/>
                   </wp:cNvGraphicFramePr>
@@ -3771,7 +3737,7 @@
                           <pic:cNvPicPr/>
                         </pic:nvPicPr>
                         <pic:blipFill>
-                          <a:blip r:embed="rId24"/>
+                          <a:blip r:embed="rId23"/>
                           <a:stretch>
                             <a:fillRect/>
                           </a:stretch>
@@ -3966,7 +3932,7 @@
               <w:drawing>
                 <wp:inline xmlns:a="http://schemas.openxmlformats.org/drawingml/2006/main" xmlns:pic="http://schemas.openxmlformats.org/drawingml/2006/picture">
                   <wp:extent cx="234000" cy="234000"/>
-                  <wp:docPr id="23" name="Picture 23"/>
+                  <wp:docPr id="22" name="Picture 22"/>
                   <wp:cNvGraphicFramePr>
                     <a:graphicFrameLocks noChangeAspect="1"/>
                   </wp:cNvGraphicFramePr>
@@ -3978,7 +3944,7 @@
                           <pic:cNvPicPr/>
                         </pic:nvPicPr>
                         <pic:blipFill>
-                          <a:blip r:embed="rId20"/>
+                          <a:blip r:embed="rId19"/>
                           <a:stretch>
                             <a:fillRect/>
                           </a:stretch>
@@ -4123,7 +4089,7 @@
         <w:drawing>
           <wp:inline xmlns:a="http://schemas.openxmlformats.org/drawingml/2006/main" xmlns:pic="http://schemas.openxmlformats.org/drawingml/2006/picture">
             <wp:extent cx="198000" cy="198000"/>
-            <wp:docPr id="24" name="Picture 24"/>
+            <wp:docPr id="23" name="Picture 23"/>
             <wp:cNvGraphicFramePr>
               <a:graphicFrameLocks noChangeAspect="1"/>
             </wp:cNvGraphicFramePr>
@@ -4135,7 +4101,7 @@
                     <pic:cNvPicPr/>
                   </pic:nvPicPr>
                   <pic:blipFill>
-                    <a:blip r:embed="rId20"/>
+                    <a:blip r:embed="rId19"/>
                     <a:stretch>
                       <a:fillRect/>
                     </a:stretch>
@@ -4388,7 +4354,7 @@
         <w:drawing>
           <wp:inline xmlns:a="http://schemas.openxmlformats.org/drawingml/2006/main" xmlns:pic="http://schemas.openxmlformats.org/drawingml/2006/picture">
             <wp:extent cx="198000" cy="198000"/>
-            <wp:docPr id="25" name="Picture 25"/>
+            <wp:docPr id="24" name="Picture 24"/>
             <wp:cNvGraphicFramePr>
               <a:graphicFrameLocks noChangeAspect="1"/>
             </wp:cNvGraphicFramePr>
@@ -4400,7 +4366,7 @@
                     <pic:cNvPicPr/>
                   </pic:nvPicPr>
                   <pic:blipFill>
-                    <a:blip r:embed="rId21"/>
+                    <a:blip r:embed="rId20"/>
                     <a:stretch>
                       <a:fillRect/>
                     </a:stretch>
@@ -4511,7 +4477,7 @@
               <w:drawing>
                 <wp:inline xmlns:a="http://schemas.openxmlformats.org/drawingml/2006/main" xmlns:pic="http://schemas.openxmlformats.org/drawingml/2006/picture">
                   <wp:extent cx="180000" cy="180000"/>
-                  <wp:docPr id="26" name="Picture 26"/>
+                  <wp:docPr id="25" name="Picture 25"/>
                   <wp:cNvGraphicFramePr>
                     <a:graphicFrameLocks noChangeAspect="1"/>
                   </wp:cNvGraphicFramePr>
@@ -4523,7 +4489,7 @@
                           <pic:cNvPicPr/>
                         </pic:nvPicPr>
                         <pic:blipFill>
-                          <a:blip r:embed="rId22"/>
+                          <a:blip r:embed="rId21"/>
                           <a:stretch>
                             <a:fillRect/>
                           </a:stretch>
@@ -4569,7 +4535,7 @@
               <w:drawing>
                 <wp:inline xmlns:a="http://schemas.openxmlformats.org/drawingml/2006/main" xmlns:pic="http://schemas.openxmlformats.org/drawingml/2006/picture">
                   <wp:extent cx="180000" cy="180000"/>
-                  <wp:docPr id="27" name="Picture 27"/>
+                  <wp:docPr id="26" name="Picture 26"/>
                   <wp:cNvGraphicFramePr>
                     <a:graphicFrameLocks noChangeAspect="1"/>
                   </wp:cNvGraphicFramePr>
@@ -4581,7 +4547,7 @@
                           <pic:cNvPicPr/>
                         </pic:nvPicPr>
                         <pic:blipFill>
-                          <a:blip r:embed="rId23"/>
+                          <a:blip r:embed="rId22"/>
                           <a:stretch>
                             <a:fillRect/>
                           </a:stretch>
@@ -4787,7 +4753,7 @@
               <w:drawing>
                 <wp:inline xmlns:a="http://schemas.openxmlformats.org/drawingml/2006/main" xmlns:pic="http://schemas.openxmlformats.org/drawingml/2006/picture">
                   <wp:extent cx="216000" cy="216000"/>
-                  <wp:docPr id="28" name="Picture 28"/>
+                  <wp:docPr id="27" name="Picture 27"/>
                   <wp:cNvGraphicFramePr>
                     <a:graphicFrameLocks noChangeAspect="1"/>
                   </wp:cNvGraphicFramePr>
@@ -4799,7 +4765,7 @@
                           <pic:cNvPicPr/>
                         </pic:nvPicPr>
                         <pic:blipFill>
-                          <a:blip r:embed="rId24"/>
+                          <a:blip r:embed="rId23"/>
                           <a:stretch>
                             <a:fillRect/>
                           </a:stretch>
@@ -4992,7 +4958,7 @@
               <w:drawing>
                 <wp:inline xmlns:a="http://schemas.openxmlformats.org/drawingml/2006/main" xmlns:pic="http://schemas.openxmlformats.org/drawingml/2006/picture">
                   <wp:extent cx="252000" cy="252000"/>
-                  <wp:docPr id="29" name="Picture 29"/>
+                  <wp:docPr id="28" name="Picture 28"/>
                   <wp:cNvGraphicFramePr>
                     <a:graphicFrameLocks noChangeAspect="1"/>
                   </wp:cNvGraphicFramePr>
@@ -5004,7 +4970,7 @@
                           <pic:cNvPicPr/>
                         </pic:nvPicPr>
                         <pic:blipFill>
-                          <a:blip r:embed="rId25"/>
+                          <a:blip r:embed="rId24"/>
                           <a:stretch>
                             <a:fillRect/>
                           </a:stretch>
@@ -5082,7 +5048,7 @@
               <w:drawing>
                 <wp:inline xmlns:a="http://schemas.openxmlformats.org/drawingml/2006/main" xmlns:pic="http://schemas.openxmlformats.org/drawingml/2006/picture">
                   <wp:extent cx="324000" cy="324000"/>
-                  <wp:docPr id="30" name="Picture 30"/>
+                  <wp:docPr id="29" name="Picture 29"/>
                   <wp:cNvGraphicFramePr>
                     <a:graphicFrameLocks noChangeAspect="1"/>
                   </wp:cNvGraphicFramePr>
@@ -5094,7 +5060,7 @@
                           <pic:cNvPicPr/>
                         </pic:nvPicPr>
                         <pic:blipFill>
-                          <a:blip r:embed="rId25"/>
+                          <a:blip r:embed="rId24"/>
                           <a:stretch>
                             <a:fillRect/>
                           </a:stretch>
@@ -5139,7 +5105,7 @@
               <w:drawing>
                 <wp:inline xmlns:a="http://schemas.openxmlformats.org/drawingml/2006/main" xmlns:pic="http://schemas.openxmlformats.org/drawingml/2006/picture">
                   <wp:extent cx="324000" cy="324000"/>
-                  <wp:docPr id="31" name="Picture 31"/>
+                  <wp:docPr id="30" name="Picture 30"/>
                   <wp:cNvGraphicFramePr>
                     <a:graphicFrameLocks noChangeAspect="1"/>
                   </wp:cNvGraphicFramePr>
@@ -5151,7 +5117,7 @@
                           <pic:cNvPicPr/>
                         </pic:nvPicPr>
                         <pic:blipFill>
-                          <a:blip r:embed="rId26"/>
+                          <a:blip r:embed="rId25"/>
                           <a:stretch>
                             <a:fillRect/>
                           </a:stretch>
@@ -5196,7 +5162,7 @@
               <w:drawing>
                 <wp:inline xmlns:a="http://schemas.openxmlformats.org/drawingml/2006/main" xmlns:pic="http://schemas.openxmlformats.org/drawingml/2006/picture">
                   <wp:extent cx="324000" cy="324000"/>
-                  <wp:docPr id="32" name="Picture 32"/>
+                  <wp:docPr id="31" name="Picture 31"/>
                   <wp:cNvGraphicFramePr>
                     <a:graphicFrameLocks noChangeAspect="1"/>
                   </wp:cNvGraphicFramePr>
@@ -5208,7 +5174,7 @@
                           <pic:cNvPicPr/>
                         </pic:nvPicPr>
                         <pic:blipFill>
-                          <a:blip r:embed="rId27"/>
+                          <a:blip r:embed="rId26"/>
                           <a:stretch>
                             <a:fillRect/>
                           </a:stretch>
@@ -5302,7 +5268,7 @@
         <w:drawing>
           <wp:inline xmlns:a="http://schemas.openxmlformats.org/drawingml/2006/main" xmlns:pic="http://schemas.openxmlformats.org/drawingml/2006/picture">
             <wp:extent cx="198000" cy="198000"/>
-            <wp:docPr id="33" name="Picture 33"/>
+            <wp:docPr id="32" name="Picture 32"/>
             <wp:cNvGraphicFramePr>
               <a:graphicFrameLocks noChangeAspect="1"/>
             </wp:cNvGraphicFramePr>
@@ -5314,7 +5280,7 @@
                     <pic:cNvPicPr/>
                   </pic:nvPicPr>
                   <pic:blipFill>
-                    <a:blip r:embed="rId28"/>
+                    <a:blip r:embed="rId27"/>
                     <a:stretch>
                       <a:fillRect/>
                     </a:stretch>
@@ -5380,7 +5346,7 @@
               <w:drawing>
                 <wp:inline xmlns:a="http://schemas.openxmlformats.org/drawingml/2006/main" xmlns:pic="http://schemas.openxmlformats.org/drawingml/2006/picture">
                   <wp:extent cx="216000" cy="216000"/>
-                  <wp:docPr id="34" name="Picture 34"/>
+                  <wp:docPr id="33" name="Picture 33"/>
                   <wp:cNvGraphicFramePr>
                     <a:graphicFrameLocks noChangeAspect="1"/>
                   </wp:cNvGraphicFramePr>
@@ -5392,7 +5358,7 @@
                           <pic:cNvPicPr/>
                         </pic:nvPicPr>
                         <pic:blipFill>
-                          <a:blip r:embed="rId13"/>
+                          <a:blip r:embed="rId12"/>
                           <a:stretch>
                             <a:fillRect/>
                           </a:stretch>
@@ -5457,7 +5423,7 @@
               <w:drawing>
                 <wp:inline xmlns:a="http://schemas.openxmlformats.org/drawingml/2006/main" xmlns:pic="http://schemas.openxmlformats.org/drawingml/2006/picture">
                   <wp:extent cx="216000" cy="216000"/>
-                  <wp:docPr id="35" name="Picture 35"/>
+                  <wp:docPr id="34" name="Picture 34"/>
                   <wp:cNvGraphicFramePr>
                     <a:graphicFrameLocks noChangeAspect="1"/>
                   </wp:cNvGraphicFramePr>
@@ -5469,7 +5435,7 @@
                           <pic:cNvPicPr/>
                         </pic:nvPicPr>
                         <pic:blipFill>
-                          <a:blip r:embed="rId14"/>
+                          <a:blip r:embed="rId13"/>
                           <a:stretch>
                             <a:fillRect/>
                           </a:stretch>
@@ -5553,7 +5519,7 @@
               <w:drawing>
                 <wp:inline xmlns:a="http://schemas.openxmlformats.org/drawingml/2006/main" xmlns:pic="http://schemas.openxmlformats.org/drawingml/2006/picture">
                   <wp:extent cx="216000" cy="216000"/>
-                  <wp:docPr id="36" name="Picture 36"/>
+                  <wp:docPr id="35" name="Picture 35"/>
                   <wp:cNvGraphicFramePr>
                     <a:graphicFrameLocks noChangeAspect="1"/>
                   </wp:cNvGraphicFramePr>
@@ -5565,7 +5531,7 @@
                           <pic:cNvPicPr/>
                         </pic:nvPicPr>
                         <pic:blipFill>
-                          <a:blip r:embed="rId15"/>
+                          <a:blip r:embed="rId14"/>
                           <a:stretch>
                             <a:fillRect/>
                           </a:stretch>
@@ -5630,7 +5596,7 @@
               <w:drawing>
                 <wp:inline xmlns:a="http://schemas.openxmlformats.org/drawingml/2006/main" xmlns:pic="http://schemas.openxmlformats.org/drawingml/2006/picture">
                   <wp:extent cx="216000" cy="216000"/>
-                  <wp:docPr id="37" name="Picture 37"/>
+                  <wp:docPr id="36" name="Picture 36"/>
                   <wp:cNvGraphicFramePr>
                     <a:graphicFrameLocks noChangeAspect="1"/>
                   </wp:cNvGraphicFramePr>
@@ -5642,7 +5608,7 @@
                           <pic:cNvPicPr/>
                         </pic:nvPicPr>
                         <pic:blipFill>
-                          <a:blip r:embed="rId16"/>
+                          <a:blip r:embed="rId15"/>
                           <a:stretch>
                             <a:fillRect/>
                           </a:stretch>

</xml_diff>